<commit_message>
Changed camera settings. Also forgot to mention in the previous commit, i added a custom event and error handler.
</commit_message>
<xml_diff>
--- a/LOGS/HOD_error_log.docx
+++ b/LOGS/HOD_error_log.docx
@@ -2,724 +2,6 @@
 <file path=word/document.xml><?xml version="1.0" encoding="utf-8"?>
 <w:document xmlns:wpc="http://schemas.microsoft.com/office/word/2010/wordprocessingCanvas" xmlns:cx="http://schemas.microsoft.com/office/drawing/2014/chartex" xmlns:cx1="http://schemas.microsoft.com/office/drawing/2015/9/8/chartex" xmlns:cx2="http://schemas.microsoft.com/office/drawing/2015/10/21/chartex" xmlns:cx3="http://schemas.microsoft.com/office/drawing/2016/5/9/chartex" xmlns:cx4="http://schemas.microsoft.com/office/drawing/2016/5/10/chartex" xmlns:cx5="http://schemas.microsoft.com/office/drawing/2016/5/11/chartex" xmlns:cx6="http://schemas.microsoft.com/office/drawing/2016/5/12/chartex" xmlns:cx7="http://schemas.microsoft.com/office/drawing/2016/5/13/chartex" xmlns:cx8="http://schemas.microsoft.com/office/drawing/2016/5/14/chartex" xmlns:mc="http://schemas.openxmlformats.org/markup-compatibility/2006" xmlns:aink="http://schemas.microsoft.com/office/drawing/2016/ink" xmlns:am3d="http://schemas.microsoft.com/office/drawing/2017/model3d" xmlns:o="urn:schemas-microsoft-com:office:office" xmlns:oel="http://schemas.microsoft.com/office/2019/extlst" xmlns:r="http://schemas.openxmlformats.org/officeDocument/2006/relationships" xmlns:m="http://schemas.openxmlformats.org/officeDocument/2006/math" xmlns:v="urn:schemas-microsoft-com:vml" xmlns:wp14="http://schemas.microsoft.com/office/word/2010/wordprocessingDrawing" xmlns:wp="http://schemas.openxmlformats.org/drawingml/2006/wordprocessingDrawing" xmlns:w10="urn:schemas-microsoft-com:office:word" xmlns:w="http://schemas.openxmlformats.org/wordprocessingml/2006/main" xmlns:w14="http://schemas.microsoft.com/office/word/2010/wordml" xmlns:w15="http://schemas.microsoft.com/office/word/2012/wordml" xmlns:w16cex="http://schemas.microsoft.com/office/word/2018/wordml/cex" xmlns:w16cid="http://schemas.microsoft.com/office/word/2016/wordml/cid" xmlns:w16="http://schemas.microsoft.com/office/word/2018/wordml" xmlns:w16du="http://schemas.microsoft.com/office/word/2023/wordml/word16du" xmlns:w16sdtdh="http://schemas.microsoft.com/office/word/2020/wordml/sdtdatahash" xmlns:w16sdtfl="http://schemas.microsoft.com/office/word/2024/wordml/sdtformatlock" xmlns:w16se="http://schemas.microsoft.com/office/word/2015/wordml/symex" xmlns:wpg="http://schemas.microsoft.com/office/word/2010/wordprocessingGroup" xmlns:wpi="http://schemas.microsoft.com/office/word/2010/wordprocessingInk" xmlns:wne="http://schemas.microsoft.com/office/word/2006/wordml" xmlns:wps="http://schemas.microsoft.com/office/word/2010/wordprocessingShape" mc:Ignorable="w14 w15 w16se w16cid w16 w16cex w16sdtdh w16sdtfl w16du wp14">
   <w:body>
-    <w:p>
-      <w:pPr>
-        <w:rPr>
-          <w:b/>
-          <w:bCs/>
-        </w:rPr>
-      </w:pPr>
-      <w:r>
-        <w:rPr>
-          <w:b/>
-          <w:bCs/>
-        </w:rPr>
-        <w:t>HOUSE OF DECEPTIONS ERROR LOG</w:t>
-      </w:r>
-    </w:p>
-    <w:p>
-      <w:pPr>
-        <w:rPr>
-          <w:b/>
-          <w:bCs/>
-        </w:rPr>
-      </w:pPr>
-      <w:proofErr w:type="gramStart"/>
-      <w:r>
-        <w:rPr>
-          <w:b/>
-          <w:bCs/>
-        </w:rPr>
-        <w:t>001 :</w:t>
-      </w:r>
-      <w:proofErr w:type="gramEnd"/>
-    </w:p>
-    <w:p>
-      <w:r>
-        <w:t xml:space="preserve">E 0:00:01:215   void </w:t>
-      </w:r>
-      <w:proofErr w:type="spellStart"/>
-      <w:r>
-        <w:t>OPlayer.InteractionAreaEntered</w:t>
-      </w:r>
-      <w:proofErr w:type="spellEnd"/>
-      <w:r>
-        <w:t xml:space="preserve">(Godot.Area2D): </w:t>
-      </w:r>
-      <w:proofErr w:type="spellStart"/>
-      <w:r>
-        <w:t>System.NullReferenceException</w:t>
-      </w:r>
-      <w:proofErr w:type="spellEnd"/>
-      <w:r>
-        <w:t>: Object reference not set to an instance of an object.</w:t>
-      </w:r>
-    </w:p>
-    <w:p>
-      <w:r>
-        <w:t xml:space="preserve">  &lt;C# Error&gt;    </w:t>
-      </w:r>
-      <w:proofErr w:type="spellStart"/>
-      <w:r>
-        <w:t>System.NullReferenceException</w:t>
-      </w:r>
-      <w:proofErr w:type="spellEnd"/>
-    </w:p>
-    <w:p>
-      <w:r>
-        <w:t xml:space="preserve">  &lt;C# Source&gt;   OPlayer.cs:200 @ void </w:t>
-      </w:r>
-      <w:proofErr w:type="spellStart"/>
-      <w:r>
-        <w:t>OPlayer.InteractionAreaEntered</w:t>
-      </w:r>
-      <w:proofErr w:type="spellEnd"/>
-      <w:r>
-        <w:t>(Godot.Area2D)</w:t>
-      </w:r>
-    </w:p>
-    <w:p>
-      <w:r>
-        <w:t xml:space="preserve">  &lt;Stack Trace&gt; OPlayer.cs:200 @ void </w:t>
-      </w:r>
-      <w:proofErr w:type="spellStart"/>
-      <w:r>
-        <w:t>OPlayer.InteractionAreaEntered</w:t>
-      </w:r>
-      <w:proofErr w:type="spellEnd"/>
-      <w:r>
-        <w:t>(Godot.Area2D)</w:t>
-      </w:r>
-    </w:p>
-    <w:p>
-      <w:r>
-        <w:t xml:space="preserve">                OPlayer_ScriptMethods.generated.cs:84 @ bool OPlayer.InvokeGodotClassMethod(</w:t>
-      </w:r>
-      <w:proofErr w:type="gramStart"/>
-      <w:r>
-        <w:t>Godot.NativeInterop.godot</w:t>
-      </w:r>
-      <w:proofErr w:type="gramEnd"/>
-      <w:r>
-        <w:t xml:space="preserve">_string_name&amp;, </w:t>
-      </w:r>
-      <w:proofErr w:type="spellStart"/>
-      <w:proofErr w:type="gramStart"/>
-      <w:r>
-        <w:t>Godot.NativeInterop.NativeVariantPtrArgs</w:t>
-      </w:r>
-      <w:proofErr w:type="spellEnd"/>
-      <w:proofErr w:type="gramEnd"/>
-      <w:r>
-        <w:t xml:space="preserve">, </w:t>
-      </w:r>
-      <w:proofErr w:type="spellStart"/>
-      <w:proofErr w:type="gramStart"/>
-      <w:r>
-        <w:t>Godot.NativeInterop.godot</w:t>
-      </w:r>
-      <w:proofErr w:type="gramEnd"/>
-      <w:r>
-        <w:t>_variant</w:t>
-      </w:r>
-      <w:proofErr w:type="spellEnd"/>
-      <w:r>
-        <w:t>&amp;)</w:t>
-      </w:r>
-    </w:p>
-    <w:p>
-      <w:r>
-        <w:t xml:space="preserve">                CSharpInstanceBridge.cs:24 @ </w:t>
-      </w:r>
-      <w:proofErr w:type="spellStart"/>
-      <w:proofErr w:type="gramStart"/>
-      <w:r>
-        <w:t>Godot.NativeInterop.godot</w:t>
-      </w:r>
-      <w:proofErr w:type="gramEnd"/>
-      <w:r>
-        <w:t>_bool</w:t>
-      </w:r>
-      <w:proofErr w:type="spellEnd"/>
-      <w:r>
-        <w:t xml:space="preserve"> </w:t>
-      </w:r>
-      <w:proofErr w:type="spellStart"/>
-      <w:proofErr w:type="gramStart"/>
-      <w:r>
-        <w:t>Godot.Bridge.CSharpInstanceBridge.Call</w:t>
-      </w:r>
-      <w:proofErr w:type="spellEnd"/>
-      <w:proofErr w:type="gramEnd"/>
-      <w:r>
-        <w:t>(</w:t>
-      </w:r>
-      <w:proofErr w:type="spellStart"/>
-      <w:r>
-        <w:t>nint</w:t>
-      </w:r>
-      <w:proofErr w:type="spellEnd"/>
-      <w:r>
-        <w:t xml:space="preserve">, </w:t>
-      </w:r>
-      <w:proofErr w:type="spellStart"/>
-      <w:proofErr w:type="gramStart"/>
-      <w:r>
-        <w:t>Godot.NativeInterop.godot</w:t>
-      </w:r>
-      <w:proofErr w:type="gramEnd"/>
-      <w:r>
-        <w:t>_string_name</w:t>
-      </w:r>
-      <w:proofErr w:type="spellEnd"/>
-      <w:r>
-        <w:t xml:space="preserve">*, </w:t>
-      </w:r>
-      <w:proofErr w:type="spellStart"/>
-      <w:proofErr w:type="gramStart"/>
-      <w:r>
-        <w:t>Godot.NativeInterop.godot</w:t>
-      </w:r>
-      <w:proofErr w:type="gramEnd"/>
-      <w:r>
-        <w:t>_variant</w:t>
-      </w:r>
-      <w:proofErr w:type="spellEnd"/>
-      <w:r>
-        <w:t xml:space="preserve">**, int, </w:t>
-      </w:r>
-      <w:proofErr w:type="spellStart"/>
-      <w:proofErr w:type="gramStart"/>
-      <w:r>
-        <w:t>Godot.NativeInterop.godot</w:t>
-      </w:r>
-      <w:proofErr w:type="gramEnd"/>
-      <w:r>
-        <w:t>_variant_call_error</w:t>
-      </w:r>
-      <w:proofErr w:type="spellEnd"/>
-      <w:r>
-        <w:t xml:space="preserve">*, </w:t>
-      </w:r>
-      <w:proofErr w:type="spellStart"/>
-      <w:proofErr w:type="gramStart"/>
-      <w:r>
-        <w:t>Godot.NativeInterop.godot</w:t>
-      </w:r>
-      <w:proofErr w:type="gramEnd"/>
-      <w:r>
-        <w:t>_variant</w:t>
-      </w:r>
-      <w:proofErr w:type="spellEnd"/>
-      <w:r>
-        <w:t>*)</w:t>
-      </w:r>
-    </w:p>
-    <w:p>
-      <w:pPr>
-        <w:pBdr>
-          <w:bottom w:val="single" w:sz="6" w:space="1" w:color="auto"/>
-        </w:pBdr>
-      </w:pPr>
-    </w:p>
-    <w:p>
-      <w:pPr>
-        <w:rPr>
-          <w:b/>
-          <w:bCs/>
-        </w:rPr>
-      </w:pPr>
-      <w:r>
-        <w:rPr>
-          <w:b/>
-          <w:bCs/>
-        </w:rPr>
-        <w:t>002:</w:t>
-      </w:r>
-    </w:p>
-    <w:p>
-      <w:r>
-        <w:t xml:space="preserve">E 0:00:06:136   void </w:t>
-      </w:r>
-      <w:proofErr w:type="spellStart"/>
-      <w:proofErr w:type="gramStart"/>
-      <w:r>
-        <w:t>OPlayer</w:t>
-      </w:r>
-      <w:proofErr w:type="spellEnd"/>
-      <w:r>
-        <w:t>._Input(</w:t>
-      </w:r>
-      <w:proofErr w:type="spellStart"/>
-      <w:proofErr w:type="gramEnd"/>
-      <w:r>
-        <w:t>Godot.InputEvent</w:t>
-      </w:r>
-      <w:proofErr w:type="spellEnd"/>
-      <w:r>
-        <w:t xml:space="preserve">): </w:t>
-      </w:r>
-      <w:proofErr w:type="spellStart"/>
-      <w:r>
-        <w:t>System.NullReferenceException</w:t>
-      </w:r>
-      <w:proofErr w:type="spellEnd"/>
-      <w:r>
-        <w:t>: Object reference not set to an instance of an object.</w:t>
-      </w:r>
-    </w:p>
-    <w:p>
-      <w:r>
-        <w:t xml:space="preserve">  &lt;C# Error&gt;    </w:t>
-      </w:r>
-      <w:proofErr w:type="spellStart"/>
-      <w:r>
-        <w:t>System.NullReferenceException</w:t>
-      </w:r>
-      <w:proofErr w:type="spellEnd"/>
-    </w:p>
-    <w:p>
-      <w:r>
-        <w:t xml:space="preserve">  &lt;C# Source&gt;   OPlayer.cs:180 @ void </w:t>
-      </w:r>
-      <w:proofErr w:type="spellStart"/>
-      <w:proofErr w:type="gramStart"/>
-      <w:r>
-        <w:t>OPlayer</w:t>
-      </w:r>
-      <w:proofErr w:type="spellEnd"/>
-      <w:r>
-        <w:t>._Input(</w:t>
-      </w:r>
-      <w:proofErr w:type="spellStart"/>
-      <w:proofErr w:type="gramEnd"/>
-      <w:r>
-        <w:t>Godot.InputEvent</w:t>
-      </w:r>
-      <w:proofErr w:type="spellEnd"/>
-      <w:r>
-        <w:t>)</w:t>
-      </w:r>
-    </w:p>
-    <w:p>
-      <w:r>
-        <w:t xml:space="preserve">  &lt;Stack Trace&gt; OPlayer.cs:180 @ void </w:t>
-      </w:r>
-      <w:proofErr w:type="spellStart"/>
-      <w:proofErr w:type="gramStart"/>
-      <w:r>
-        <w:t>OPlayer</w:t>
-      </w:r>
-      <w:proofErr w:type="spellEnd"/>
-      <w:r>
-        <w:t>._Input(</w:t>
-      </w:r>
-      <w:proofErr w:type="spellStart"/>
-      <w:proofErr w:type="gramEnd"/>
-      <w:r>
-        <w:t>Godot.InputEvent</w:t>
-      </w:r>
-      <w:proofErr w:type="spellEnd"/>
-      <w:r>
-        <w:t>)</w:t>
-      </w:r>
-    </w:p>
-    <w:p>
-      <w:r>
-        <w:t xml:space="preserve">                Node.cs:2628 @ bool </w:t>
-      </w:r>
-      <w:proofErr w:type="gramStart"/>
-      <w:r>
-        <w:t>Godot.Node.InvokeGodotClassMethod</w:t>
-      </w:r>
-      <w:proofErr w:type="gramEnd"/>
-      <w:r>
-        <w:t>(</w:t>
-      </w:r>
-      <w:proofErr w:type="gramStart"/>
-      <w:r>
-        <w:t>Godot.NativeInterop.godot</w:t>
-      </w:r>
-      <w:proofErr w:type="gramEnd"/>
-      <w:r>
-        <w:t xml:space="preserve">_string_name&amp;, </w:t>
-      </w:r>
-      <w:proofErr w:type="spellStart"/>
-      <w:proofErr w:type="gramStart"/>
-      <w:r>
-        <w:t>Godot.NativeInterop.NativeVariantPtrArgs</w:t>
-      </w:r>
-      <w:proofErr w:type="spellEnd"/>
-      <w:proofErr w:type="gramEnd"/>
-      <w:r>
-        <w:t xml:space="preserve">, </w:t>
-      </w:r>
-      <w:proofErr w:type="spellStart"/>
-      <w:proofErr w:type="gramStart"/>
-      <w:r>
-        <w:t>Godot.NativeInterop.godot</w:t>
-      </w:r>
-      <w:proofErr w:type="gramEnd"/>
-      <w:r>
-        <w:t>_variant</w:t>
-      </w:r>
-      <w:proofErr w:type="spellEnd"/>
-      <w:r>
-        <w:t>&amp;)</w:t>
-      </w:r>
-    </w:p>
-    <w:p>
-      <w:r>
-        <w:t xml:space="preserve">                CanvasItem.cs:1792 @ bool </w:t>
-      </w:r>
-      <w:proofErr w:type="gramStart"/>
-      <w:r>
-        <w:t>Godot.CanvasItem.InvokeGodotClassMethod</w:t>
-      </w:r>
-      <w:proofErr w:type="gramEnd"/>
-      <w:r>
-        <w:t>(</w:t>
-      </w:r>
-      <w:proofErr w:type="gramStart"/>
-      <w:r>
-        <w:t>Godot.NativeInterop.godot</w:t>
-      </w:r>
-      <w:proofErr w:type="gramEnd"/>
-      <w:r>
-        <w:t xml:space="preserve">_string_name&amp;, </w:t>
-      </w:r>
-      <w:proofErr w:type="spellStart"/>
-      <w:proofErr w:type="gramStart"/>
-      <w:r>
-        <w:t>Godot.NativeInterop.NativeVariantPtrArgs</w:t>
-      </w:r>
-      <w:proofErr w:type="spellEnd"/>
-      <w:proofErr w:type="gramEnd"/>
-      <w:r>
-        <w:t xml:space="preserve">, </w:t>
-      </w:r>
-      <w:proofErr w:type="spellStart"/>
-      <w:proofErr w:type="gramStart"/>
-      <w:r>
-        <w:t>Godot.NativeInterop.godot</w:t>
-      </w:r>
-      <w:proofErr w:type="gramEnd"/>
-      <w:r>
-        <w:t>_variant</w:t>
-      </w:r>
-      <w:proofErr w:type="spellEnd"/>
-      <w:r>
-        <w:t>&amp;)</w:t>
-      </w:r>
-    </w:p>
-    <w:p>
-      <w:r>
-        <w:t xml:space="preserve">                Node2D.cs:557 @ bool Godot.Node2</w:t>
-      </w:r>
-      <w:proofErr w:type="gramStart"/>
-      <w:r>
-        <w:t>D.InvokeGodotClassMethod</w:t>
-      </w:r>
-      <w:proofErr w:type="gramEnd"/>
-      <w:r>
-        <w:t>(</w:t>
-      </w:r>
-      <w:proofErr w:type="gramStart"/>
-      <w:r>
-        <w:t>Godot.NativeInterop.godot</w:t>
-      </w:r>
-      <w:proofErr w:type="gramEnd"/>
-      <w:r>
-        <w:t xml:space="preserve">_string_name&amp;, </w:t>
-      </w:r>
-      <w:proofErr w:type="spellStart"/>
-      <w:proofErr w:type="gramStart"/>
-      <w:r>
-        <w:t>Godot.NativeInterop.NativeVariantPtrArgs</w:t>
-      </w:r>
-      <w:proofErr w:type="spellEnd"/>
-      <w:proofErr w:type="gramEnd"/>
-      <w:r>
-        <w:t xml:space="preserve">, </w:t>
-      </w:r>
-      <w:proofErr w:type="spellStart"/>
-      <w:proofErr w:type="gramStart"/>
-      <w:r>
-        <w:t>Godot.NativeInterop.godot</w:t>
-      </w:r>
-      <w:proofErr w:type="gramEnd"/>
-      <w:r>
-        <w:t>_variant</w:t>
-      </w:r>
-      <w:proofErr w:type="spellEnd"/>
-      <w:r>
-        <w:t>&amp;)</w:t>
-      </w:r>
-    </w:p>
-    <w:p>
-      <w:r>
-        <w:lastRenderedPageBreak/>
-        <w:t xml:space="preserve">                CollisionObject2D.cs:712 @ bool Godot.CollisionObject2</w:t>
-      </w:r>
-      <w:proofErr w:type="gramStart"/>
-      <w:r>
-        <w:t>D.InvokeGodotClassMethod</w:t>
-      </w:r>
-      <w:proofErr w:type="gramEnd"/>
-      <w:r>
-        <w:t>(</w:t>
-      </w:r>
-      <w:proofErr w:type="gramStart"/>
-      <w:r>
-        <w:t>Godot.NativeInterop.godot</w:t>
-      </w:r>
-      <w:proofErr w:type="gramEnd"/>
-      <w:r>
-        <w:t xml:space="preserve">_string_name&amp;, </w:t>
-      </w:r>
-      <w:proofErr w:type="spellStart"/>
-      <w:proofErr w:type="gramStart"/>
-      <w:r>
-        <w:t>Godot.NativeInterop.NativeVariantPtrArgs</w:t>
-      </w:r>
-      <w:proofErr w:type="spellEnd"/>
-      <w:proofErr w:type="gramEnd"/>
-      <w:r>
-        <w:t xml:space="preserve">, </w:t>
-      </w:r>
-      <w:proofErr w:type="spellStart"/>
-      <w:proofErr w:type="gramStart"/>
-      <w:r>
-        <w:t>Godot.NativeInterop.godot</w:t>
-      </w:r>
-      <w:proofErr w:type="gramEnd"/>
-      <w:r>
-        <w:t>_variant</w:t>
-      </w:r>
-      <w:proofErr w:type="spellEnd"/>
-      <w:r>
-        <w:t>&amp;)</w:t>
-      </w:r>
-    </w:p>
-    <w:p>
-      <w:r>
-        <w:t xml:space="preserve">                PhysicsBody2D.cs:122 @ bool Godot.PhysicsBody2</w:t>
-      </w:r>
-      <w:proofErr w:type="gramStart"/>
-      <w:r>
-        <w:t>D.InvokeGodotClassMethod</w:t>
-      </w:r>
-      <w:proofErr w:type="gramEnd"/>
-      <w:r>
-        <w:t>(</w:t>
-      </w:r>
-      <w:proofErr w:type="gramStart"/>
-      <w:r>
-        <w:t>Godot.NativeInterop.godot</w:t>
-      </w:r>
-      <w:proofErr w:type="gramEnd"/>
-      <w:r>
-        <w:t xml:space="preserve">_string_name&amp;, </w:t>
-      </w:r>
-      <w:proofErr w:type="spellStart"/>
-      <w:proofErr w:type="gramStart"/>
-      <w:r>
-        <w:t>Godot.NativeInterop.NativeVariantPtrArgs</w:t>
-      </w:r>
-      <w:proofErr w:type="spellEnd"/>
-      <w:proofErr w:type="gramEnd"/>
-      <w:r>
-        <w:t xml:space="preserve">, </w:t>
-      </w:r>
-      <w:proofErr w:type="spellStart"/>
-      <w:proofErr w:type="gramStart"/>
-      <w:r>
-        <w:t>Godot.NativeInterop.godot</w:t>
-      </w:r>
-      <w:proofErr w:type="gramEnd"/>
-      <w:r>
-        <w:t>_variant</w:t>
-      </w:r>
-      <w:proofErr w:type="spellEnd"/>
-      <w:r>
-        <w:t>&amp;)</w:t>
-      </w:r>
-    </w:p>
-    <w:p>
-      <w:r>
-        <w:t xml:space="preserve">                CharacterBody2D.cs:797 @ bool Godot.CharacterBody2</w:t>
-      </w:r>
-      <w:proofErr w:type="gramStart"/>
-      <w:r>
-        <w:t>D.InvokeGodotClassMethod</w:t>
-      </w:r>
-      <w:proofErr w:type="gramEnd"/>
-      <w:r>
-        <w:t>(</w:t>
-      </w:r>
-      <w:proofErr w:type="gramStart"/>
-      <w:r>
-        <w:t>Godot.NativeInterop.godot</w:t>
-      </w:r>
-      <w:proofErr w:type="gramEnd"/>
-      <w:r>
-        <w:t xml:space="preserve">_string_name&amp;, </w:t>
-      </w:r>
-      <w:proofErr w:type="spellStart"/>
-      <w:proofErr w:type="gramStart"/>
-      <w:r>
-        <w:t>Godot.NativeInterop.NativeVariantPtrArgs</w:t>
-      </w:r>
-      <w:proofErr w:type="spellEnd"/>
-      <w:proofErr w:type="gramEnd"/>
-      <w:r>
-        <w:t xml:space="preserve">, </w:t>
-      </w:r>
-      <w:proofErr w:type="spellStart"/>
-      <w:proofErr w:type="gramStart"/>
-      <w:r>
-        <w:t>Godot.NativeInterop.godot</w:t>
-      </w:r>
-      <w:proofErr w:type="gramEnd"/>
-      <w:r>
-        <w:t>_variant</w:t>
-      </w:r>
-      <w:proofErr w:type="spellEnd"/>
-      <w:r>
-        <w:t>&amp;)</w:t>
-      </w:r>
-    </w:p>
-    <w:p>
-      <w:r>
-        <w:t xml:space="preserve">                OPlayer_ScriptMethods.generated.cs:108 @ bool OPlayer.InvokeGodotClassMethod(</w:t>
-      </w:r>
-      <w:proofErr w:type="gramStart"/>
-      <w:r>
-        <w:t>Godot.NativeInterop.godot</w:t>
-      </w:r>
-      <w:proofErr w:type="gramEnd"/>
-      <w:r>
-        <w:t xml:space="preserve">_string_name&amp;, </w:t>
-      </w:r>
-      <w:proofErr w:type="spellStart"/>
-      <w:proofErr w:type="gramStart"/>
-      <w:r>
-        <w:t>Godot.NativeInterop.NativeVariantPtrArgs</w:t>
-      </w:r>
-      <w:proofErr w:type="spellEnd"/>
-      <w:proofErr w:type="gramEnd"/>
-      <w:r>
-        <w:t xml:space="preserve">, </w:t>
-      </w:r>
-      <w:proofErr w:type="spellStart"/>
-      <w:proofErr w:type="gramStart"/>
-      <w:r>
-        <w:t>Godot.NativeInterop.godot</w:t>
-      </w:r>
-      <w:proofErr w:type="gramEnd"/>
-      <w:r>
-        <w:t>_variant</w:t>
-      </w:r>
-      <w:proofErr w:type="spellEnd"/>
-      <w:r>
-        <w:t>&amp;)</w:t>
-      </w:r>
-    </w:p>
-    <w:p>
-      <w:r>
-        <w:t xml:space="preserve">                CSharpInstanceBridge.cs:24 @ </w:t>
-      </w:r>
-      <w:proofErr w:type="spellStart"/>
-      <w:proofErr w:type="gramStart"/>
-      <w:r>
-        <w:t>Godot.NativeInterop.godot</w:t>
-      </w:r>
-      <w:proofErr w:type="gramEnd"/>
-      <w:r>
-        <w:t>_bool</w:t>
-      </w:r>
-      <w:proofErr w:type="spellEnd"/>
-      <w:r>
-        <w:t xml:space="preserve"> </w:t>
-      </w:r>
-      <w:proofErr w:type="spellStart"/>
-      <w:proofErr w:type="gramStart"/>
-      <w:r>
-        <w:t>Godot.Bridge.CSharpInstanceBridge.Call</w:t>
-      </w:r>
-      <w:proofErr w:type="spellEnd"/>
-      <w:proofErr w:type="gramEnd"/>
-      <w:r>
-        <w:t>(</w:t>
-      </w:r>
-      <w:proofErr w:type="spellStart"/>
-      <w:r>
-        <w:t>nint</w:t>
-      </w:r>
-      <w:proofErr w:type="spellEnd"/>
-      <w:r>
-        <w:t xml:space="preserve">, </w:t>
-      </w:r>
-      <w:proofErr w:type="spellStart"/>
-      <w:proofErr w:type="gramStart"/>
-      <w:r>
-        <w:t>Godot.NativeInterop.godot</w:t>
-      </w:r>
-      <w:proofErr w:type="gramEnd"/>
-      <w:r>
-        <w:t>_string_name</w:t>
-      </w:r>
-      <w:proofErr w:type="spellEnd"/>
-      <w:r>
-        <w:t xml:space="preserve">*, </w:t>
-      </w:r>
-      <w:proofErr w:type="spellStart"/>
-      <w:proofErr w:type="gramStart"/>
-      <w:r>
-        <w:t>Godot.NativeInterop.godot</w:t>
-      </w:r>
-      <w:proofErr w:type="gramEnd"/>
-      <w:r>
-        <w:t>_variant</w:t>
-      </w:r>
-      <w:proofErr w:type="spellEnd"/>
-      <w:r>
-        <w:t xml:space="preserve">**, int, </w:t>
-      </w:r>
-      <w:proofErr w:type="spellStart"/>
-      <w:proofErr w:type="gramStart"/>
-      <w:r>
-        <w:t>Godot.NativeInterop.godot</w:t>
-      </w:r>
-      <w:proofErr w:type="gramEnd"/>
-      <w:r>
-        <w:t>_variant_call_error</w:t>
-      </w:r>
-      <w:proofErr w:type="spellEnd"/>
-      <w:r>
-        <w:t xml:space="preserve">*, </w:t>
-      </w:r>
-      <w:proofErr w:type="spellStart"/>
-      <w:proofErr w:type="gramStart"/>
-      <w:r>
-        <w:t>Godot.NativeInterop.godot</w:t>
-      </w:r>
-      <w:proofErr w:type="gramEnd"/>
-      <w:r>
-        <w:t>_variant</w:t>
-      </w:r>
-      <w:proofErr w:type="spellEnd"/>
-      <w:r>
-        <w:t>*)</w:t>
-      </w:r>
-    </w:p>
-    <w:p>
-      <w:pPr>
-        <w:pBdr>
-          <w:bottom w:val="single" w:sz="6" w:space="1" w:color="auto"/>
-        </w:pBdr>
-      </w:pPr>
-    </w:p>
     <w:p/>
     <w:sectPr>
       <w:pgSz w:w="12240" w:h="15840"/>

</xml_diff>